<commit_message>
descarga del reporte de lectura
</commit_message>
<xml_diff>
--- a/public/reporte_lecturas/80082041-NORIEGA ORTIZ ANGIE KATHERINEQ .docx
+++ b/public/reporte_lecturas/80082041-NORIEGA ORTIZ ANGIE KATHERINEQ .docx
@@ -546,7 +546,13 @@
         <w:spacing w:after="0"/>
       </w:pPr>
       <w:r>
-        <w:t>${firma_medico}</w:t>
+        <w:t/>
+        <w:pict>
+          <v:shape type="#_x0000_t75" style="width:100px;height:100px" stroked="f">
+            <v:imagedata r:id="rId10" o:title=""/>
+          </v:shape>
+        </w:pict>
+        <w:t/>
       </w:r>
     </w:p>
     <w:p>

</xml_diff>

<commit_message>
Correccion de notificacion por correo electronico
</commit_message>
<xml_diff>
--- a/public/reporte_lecturas/80082041-NORIEGA ORTIZ ANGIE KATHERINEQ .docx
+++ b/public/reporte_lecturas/80082041-NORIEGA ORTIZ ANGIE KATHERINEQ .docx
@@ -15,6 +15,8 @@
           <w:szCs w:val="20"/>
         </w:rPr>
       </w:pPr>
+      <w:bookmarkStart w:id="0" w:name="_GoBack"/>
+      <w:bookmarkEnd w:id="0"/>
     </w:p>
     <w:p>
       <w:pPr>
@@ -60,18 +62,8 @@
           <w:sz w:val="20"/>
           <w:szCs w:val="20"/>
         </w:rPr>
-        <w:t xml:space="preserve">     </w:t>
-      </w:r>
-      <w:r>
-        <w:rPr>
-          <w:rFonts w:ascii="Arial" w:hAnsi="Arial" w:cs="Arial"/>
-          <w:sz w:val="20"/>
-          <w:szCs w:val="20"/>
-        </w:rPr>
-        <w:t xml:space="preserve">                 </w:t>
-      </w:r>
-      <w:bookmarkStart w:id="0" w:name="_GoBack"/>
-      <w:bookmarkEnd w:id="0"/>
+        <w:t xml:space="preserve">                                     </w:t>
+      </w:r>
       <w:proofErr w:type="spellStart"/>
       <w:r>
         <w:rPr>
@@ -1628,7 +1620,7 @@
 </file>
 
 <file path=customXml/itemProps1.xml><?xml version="1.0" encoding="utf-8"?>
-<ds:datastoreItem xmlns:ds="http://schemas.openxmlformats.org/officeDocument/2006/customXml" ds:itemID="{7538D80E-C31C-414E-8B6C-CD1F0967E40E}">
+<ds:datastoreItem xmlns:ds="http://schemas.openxmlformats.org/officeDocument/2006/customXml" ds:itemID="{4C4416A9-F4F3-4880-8320-77A31546E3AD}">
   <ds:schemaRefs>
     <ds:schemaRef ds:uri="http://schemas.openxmlformats.org/officeDocument/2006/bibliography"/>
   </ds:schemaRefs>

</xml_diff>